<commit_message>
3. adım adı: Optik kontrol ve ölçü kontrolü (site, SOP, formlar); doldurulmuş optik form ölçü satırları
Co-Authored-By: Claude Sonnet 5.5 <noreply@anthropic.com>
Claude-Session: https://claude.ai/code/session_01J6foNXTwf1dGzDjULYpfrk
</commit_message>
<xml_diff>
--- a/prosedurler/EMS.QA.PRO.02.14. Final Inspection and Release Procedure.docx
+++ b/prosedurler/EMS.QA.PRO.02.14. Final Inspection and Release Procedure.docx
@@ -1205,7 +1205,7 @@
           <w:sz w:val="24"/>
           <w:szCs w:val="24"/>
         </w:rPr>
-        <w:t xml:space="preserve">EMS.QA.PRO.02.13. Optical Inspection Procedure; EMS.QA.PRO.02.05. Metal Detector Control Procedure; EMS.QA.TL.02.06. Metal Detector Test and Record Instruction</w:t>
+        <w:t xml:space="preserve">EMS.QA.PRO.02.13. Optical and Measurement Inspection Procedure; EMS.QA.PRO.02.05. Metal Detector Control Procedure; EMS.QA.TL.02.06. Metal Detector Test and Record Instruction</w:t>
       </w:r>
     </w:p>
     <w:p>
@@ -2697,7 +2697,7 @@
           <w:sz w:val="24"/>
           <w:szCs w:val="24"/>
         </w:rPr>
-        <w:t xml:space="preserve">EMS.QA.PRO.02.13. إجراء الفحص البصري؛ EMS.QA.PRO.02.05. إجراء مراقبة كاشف المعادن؛ EMS.QA.TL.02.06. تعليمات اختبار كاشف المعادن وتسجيل النتائج</w:t>
+        <w:t xml:space="preserve">EMS.QA.PRO.02.13. إجراء الفحص البصري وفحص المقاسات؛ EMS.QA.PRO.02.05. إجراء مراقبة كاشف المعادن؛ EMS.QA.TL.02.06. تعليمات اختبار كاشف المعادن وتسجيل النتائج</w:t>
       </w:r>
     </w:p>
     <w:p>

</xml_diff>